<commit_message>
Critique fix round (23/32 baseline): mobile header, tiered red, skills after experience, contact/CTA close
- Phone: name beside a 96px DETAIL A (84px at 320), one-row 44px toolbar PDF/Word/Text, contact items one per row with 44px-class hit areas, URLs never break mid-word
- Two-tier figures: .fig red for outcomes only; .num ink-bold for scale/tenure; summary demotes its repeats of KEY ACHIEVEMENTS; NOTES legend updated
- Section order: PROFESSIONAL EXPERIENCE before TECHNICAL SKILLS on the sheets and in DOCX/TXT/MD (same ATS keyword coverage; compat still 100/100)
- Contact separators as CSS hairline bars; screen-only continuation cue on sheet 2; colophon closes with Email / Call / Download PDF
- REV is a letter (A); DESIGN.md, design.json and the surface brief synced to the built world; critique snapshot closed
</commit_message>
<xml_diff>
--- a/Patrick_Padgett_Resume.docx
+++ b/Patrick_Padgett_Resume.docx
@@ -124,131 +124,6 @@
       </w:pPr>
       <w:r>
         <w:t>Led the $50M replacement of Sprint's legacy billing mediation system (Marconi CEOS) with Openet FusionWorks across 130 switches - requirements, RFP, 12-vendor evaluation and selection.</w:t>
-      </w:r>
-    </w:p>
-    <w:p>
-      <w:pPr>
-        <w:spacing w:after="60" w:before="200"/>
-      </w:pPr>
-      <w:r>
-        <w:rPr>
-          <w:b/>
-          <w:i w:val="0"/>
-          <w:sz w:val="24"/>
-        </w:rPr>
-        <w:t>TECHNICAL SKILLS</w:t>
-      </w:r>
-    </w:p>
-    <w:p>
-      <w:pPr>
-        <w:spacing w:after="40"/>
-      </w:pPr>
-      <w:r>
-        <w:rPr>
-          <w:b/>
-        </w:rPr>
-        <w:t xml:space="preserve">Telecom billing / mediation: </w:t>
-      </w:r>
-      <w:r>
-        <w:t>billing mediation, revenue assurance, CDR/EDR/AMA usage-record pipelines, rating and charging, Nortel / Ericsson / Lucent switch data formats, BSS/OSS, mediation rules, data reconciliation, Tier III production support, root cause analysis, ETL, Oracle SQL</w:t>
-      </w:r>
-    </w:p>
-    <w:p>
-      <w:pPr>
-        <w:spacing w:after="40"/>
-      </w:pPr>
-      <w:r>
-        <w:rPr>
-          <w:b/>
-        </w:rPr>
-        <w:t xml:space="preserve">Unix / Linux / OS: </w:t>
-      </w:r>
-      <w:r>
-        <w:t>RHEL, CentOS, Debian, Ubuntu, HP/UX, Solaris, FreeBSD, Red Hat Satellite, Windows Server, Active Directory / IAM</w:t>
-      </w:r>
-    </w:p>
-    <w:p>
-      <w:pPr>
-        <w:spacing w:after="40"/>
-      </w:pPr>
-      <w:r>
-        <w:rPr>
-          <w:b/>
-        </w:rPr>
-        <w:t xml:space="preserve">IaC &amp; configuration management: </w:t>
-      </w:r>
-      <w:r>
-        <w:t>Terraform, Ansible (playbooks, roles, YAML, Jinja2), CloudFormation, Puppet, Chef, Salt</w:t>
-      </w:r>
-    </w:p>
-    <w:p>
-      <w:pPr>
-        <w:spacing w:after="40"/>
-      </w:pPr>
-      <w:r>
-        <w:rPr>
-          <w:b/>
-        </w:rPr>
-        <w:t xml:space="preserve">CI/CD &amp; version control: </w:t>
-      </w:r>
-      <w:r>
-        <w:t>Azure DevOps, GitHub Actions, GitLab CI/CD, Jenkins, Octopus Deploy, Git, pull-request code review and branching/tagging strategy; canary / A-B / blue-green deployment</w:t>
-      </w:r>
-    </w:p>
-    <w:p>
-      <w:pPr>
-        <w:spacing w:after="40"/>
-      </w:pPr>
-      <w:r>
-        <w:rPr>
-          <w:b/>
-        </w:rPr>
-        <w:t xml:space="preserve">Cloud, containers &amp; virtualization: </w:t>
-      </w:r>
-      <w:r>
-        <w:t>AWS (EC2, S3, RDS, VPC), Microsoft Azure (VMs, Storage, Virtual Networking, Azure DevOps), Google Cloud Platform, hybrid cloud, Docker, Kubernetes, microservices, KVM, VMware ESX/vCenter/Horizon</w:t>
-      </w:r>
-    </w:p>
-    <w:p>
-      <w:pPr>
-        <w:spacing w:after="40"/>
-      </w:pPr>
-      <w:r>
-        <w:rPr>
-          <w:b/>
-        </w:rPr>
-        <w:t xml:space="preserve">Monitoring &amp; observability: </w:t>
-      </w:r>
-      <w:r>
-        <w:t>ELK Stack (Elasticsearch, Logstash, Kibana), Splunk, Dynatrace, Prometheus, Grafana, centralized logging, alerting and dashboards, SLOs/SLIs, on-call incident response, postmortems and root cause analysis (RCA), SRE practices</w:t>
-      </w:r>
-    </w:p>
-    <w:p>
-      <w:pPr>
-        <w:spacing w:after="40"/>
-      </w:pPr>
-      <w:r>
-        <w:rPr>
-          <w:b/>
-        </w:rPr>
-        <w:t xml:space="preserve">Programming &amp; scripting: </w:t>
-      </w:r>
-      <w:r>
-        <w:t>Python, Perl, PHP, Ruby, C / C++ / C#, Java, JavaScript / TypeScript, SQL, bash / korn / zsh, PowerShell; Ruby on Rails, Django, .NET Core, REST API design; Oracle, MySQL, PostgreSQL</w:t>
-      </w:r>
-    </w:p>
-    <w:p>
-      <w:pPr>
-        <w:spacing w:after="40"/>
-      </w:pPr>
-      <w:r>
-        <w:rPr>
-          <w:b/>
-        </w:rPr>
-        <w:t xml:space="preserve">Operations &amp; ITSM: </w:t>
-      </w:r>
-      <w:r>
-        <w:t>on-call and Tier 2/3 escalation, troubleshooting, release and change management, capacity planning, backup and disaster recovery, SOPs and runbooks, vendor management, ITIL, SDLC (Agile, Scrum, Waterfall), Jira Service Management, Confluence</w:t>
       </w:r>
     </w:p>
     <w:p>
@@ -594,7 +469,132 @@
           <w:b w:val="0"/>
           <w:i w:val="0"/>
         </w:rPr>
-        <w:t>Ran Unix systems and networks serving 3,000 subscribers for six dial-up-era ISPs and consultancies; shipped first commercial software at 13.</w:t>
+        <w:t>Ran Unix systems and networks serving 3,000 subscribers for six dial-up-era ISPs; shipped first commercial software at 13.</w:t>
+      </w:r>
+    </w:p>
+    <w:p>
+      <w:pPr>
+        <w:spacing w:after="60" w:before="200"/>
+      </w:pPr>
+      <w:r>
+        <w:rPr>
+          <w:b/>
+          <w:i w:val="0"/>
+          <w:sz w:val="24"/>
+        </w:rPr>
+        <w:t>TECHNICAL SKILLS</w:t>
+      </w:r>
+    </w:p>
+    <w:p>
+      <w:pPr>
+        <w:spacing w:after="40"/>
+      </w:pPr>
+      <w:r>
+        <w:rPr>
+          <w:b/>
+        </w:rPr>
+        <w:t xml:space="preserve">Telecom billing / mediation: </w:t>
+      </w:r>
+      <w:r>
+        <w:t>billing mediation, revenue assurance, CDR/EDR/AMA usage-record pipelines, rating and charging, Nortel / Ericsson / Lucent switch data formats, BSS/OSS, mediation rules, data reconciliation, Tier III production support, root cause analysis, ETL, Oracle SQL</w:t>
+      </w:r>
+    </w:p>
+    <w:p>
+      <w:pPr>
+        <w:spacing w:after="40"/>
+      </w:pPr>
+      <w:r>
+        <w:rPr>
+          <w:b/>
+        </w:rPr>
+        <w:t xml:space="preserve">Unix / Linux / OS: </w:t>
+      </w:r>
+      <w:r>
+        <w:t>RHEL, CentOS, Debian, Ubuntu, HP/UX, Solaris, FreeBSD, Red Hat Satellite, Windows Server</w:t>
+      </w:r>
+    </w:p>
+    <w:p>
+      <w:pPr>
+        <w:spacing w:after="40"/>
+      </w:pPr>
+      <w:r>
+        <w:rPr>
+          <w:b/>
+        </w:rPr>
+        <w:t xml:space="preserve">IaC &amp; configuration management: </w:t>
+      </w:r>
+      <w:r>
+        <w:t>Terraform, Ansible (playbooks, roles, YAML, Jinja2), CloudFormation, Puppet, Chef</w:t>
+      </w:r>
+    </w:p>
+    <w:p>
+      <w:pPr>
+        <w:spacing w:after="40"/>
+      </w:pPr>
+      <w:r>
+        <w:rPr>
+          <w:b/>
+        </w:rPr>
+        <w:t xml:space="preserve">CI/CD &amp; version control: </w:t>
+      </w:r>
+      <w:r>
+        <w:t>Azure DevOps, GitHub Actions, GitLab CI/CD, Jenkins, Octopus Deploy, Git, pull-request code review and branching/tagging strategy; canary / A-B / blue-green deployment</w:t>
+      </w:r>
+    </w:p>
+    <w:p>
+      <w:pPr>
+        <w:spacing w:after="40"/>
+      </w:pPr>
+      <w:r>
+        <w:rPr>
+          <w:b/>
+        </w:rPr>
+        <w:t xml:space="preserve">Cloud, containers &amp; virtualization: </w:t>
+      </w:r>
+      <w:r>
+        <w:t>AWS (EC2, S3, RDS, VPC), Microsoft Azure (VMs, Storage, Virtual Networking, Azure DevOps), Google Cloud Platform, hybrid cloud, Docker, Kubernetes, microservices, KVM, VMware ESX/vCenter/Horizon</w:t>
+      </w:r>
+    </w:p>
+    <w:p>
+      <w:pPr>
+        <w:spacing w:after="40"/>
+      </w:pPr>
+      <w:r>
+        <w:rPr>
+          <w:b/>
+        </w:rPr>
+        <w:t xml:space="preserve">Monitoring &amp; observability: </w:t>
+      </w:r>
+      <w:r>
+        <w:t>ELK Stack (Elasticsearch, Logstash, Kibana), Splunk, Dynatrace, Prometheus, Grafana, centralized logging, alerting and dashboards, SLOs/SLIs, on-call incident response, postmortems and root cause analysis (RCA), SRE practices</w:t>
+      </w:r>
+    </w:p>
+    <w:p>
+      <w:pPr>
+        <w:spacing w:after="40"/>
+      </w:pPr>
+      <w:r>
+        <w:rPr>
+          <w:b/>
+        </w:rPr>
+        <w:t xml:space="preserve">Programming &amp; scripting: </w:t>
+      </w:r>
+      <w:r>
+        <w:t>Python, Perl, PHP, Ruby, C / C++ / C#, Java, JavaScript / TypeScript, SQL, bash / korn / zsh, PowerShell; Ruby on Rails, Django, .NET Core, REST API design; Oracle, MySQL, PostgreSQL</w:t>
+      </w:r>
+    </w:p>
+    <w:p>
+      <w:pPr>
+        <w:spacing w:after="40"/>
+      </w:pPr>
+      <w:r>
+        <w:rPr>
+          <w:b/>
+        </w:rPr>
+        <w:t xml:space="preserve">Operations &amp; ITSM: </w:t>
+      </w:r>
+      <w:r>
+        <w:t>on-call and Tier 2/3 escalation, troubleshooting, release and change management, capacity planning, backup and disaster recovery, SOPs and runbooks, vendor management, ITIL, SDLC (Agile, Scrum, Waterfall), Jira Service Management, Confluence</w:t>
       </w:r>
     </w:p>
     <w:p>

</xml_diff>

<commit_message>
PROJECTS: add the 2026 open-source tools (undo, whom, huh); tighter sheet margins to keep every bullet; font-source fallback
</commit_message>
<xml_diff>
--- a/Patrick_Padgett_Resume.docx
+++ b/Patrick_Padgett_Resume.docx
@@ -636,6 +636,30 @@
     </w:p>
     <w:p>
       <w:pPr>
+        <w:spacing w:after="20" w:before="0"/>
+      </w:pPr>
+      <w:r>
+        <w:rPr>
+          <w:b/>
+          <w:i w:val="0"/>
+        </w:rPr>
+        <w:t>undo, whom, huh | Creator | Python 3 (standard library only), pytest, GitHub Actions | 2026 | github.com/patpadgett</w:t>
+      </w:r>
+    </w:p>
+    <w:p>
+      <w:pPr>
+        <w:spacing w:after="80" w:before="0"/>
+      </w:pPr>
+      <w:r>
+        <w:rPr>
+          <w:b w:val="0"/>
+          <w:i w:val="0"/>
+        </w:rPr>
+        <w:t>Three single-file Linux tools shipped in 2026, MIT, with unit tests: undo (a shell undo button for mv, cp, rm, chmod, chown, ln, mkdir, rmdir), whom (who to ask about a file and whether they are awake, from git history; PyPI whom-cli) and huh (what is this string: 56 detectors, 110 tests in CI; PyPI whatsthis).</w:t>
+      </w:r>
+    </w:p>
+    <w:p>
+      <w:pPr>
         <w:spacing w:after="60" w:before="200"/>
       </w:pPr>
       <w:r>

</xml_diff>